<commit_message>
Record candidate evidence and harden reproducible server workflow
</commit_message>
<xml_diff>
--- a/AV-Nav_主动视觉验证零样本目标导航研究方案.docx
+++ b/AV-Nav_主动视觉验证零样本目标导航研究方案.docx
@@ -2033,7 +2033,7 @@
           <w:rFonts w:hint="eastAsia"/>
           <w:color w:val="000000"/>
         </w:rPr>
-        <w:t>正式开发建议从训练场景按场景划分</w:t>
+        <w:t>正式开发从训练场景按场景划分</w:t>
       </w:r>
       <w:r>
         <w:rPr>
@@ -2059,20 +2059,85 @@
           <w:rFonts w:hint="eastAsia"/>
           <w:color w:val="000000"/>
         </w:rPr>
-        <w:t>。必须保证场景不重叠、清单固定、随机种子记录。当前</w:t>
-      </w:r>
-      <w:r>
-        <w:rPr>
-          <w:color w:val="000000"/>
-        </w:rPr>
-        <w:t xml:space="preserve"> make_split </w:t>
-      </w:r>
-      <w:r>
-        <w:rPr>
-          <w:rFonts w:hint="eastAsia"/>
-          <w:color w:val="000000"/>
-        </w:rPr>
-        <w:t>工具提供稳定类别分层抽样，但不会自动创建互斥场景划分；在构建正式两组清单前应加入场景约束并核查交集。</w:t>
+        <w:t>。</w:t>
+      </w:r>
+      <w:r>
+        <w:rPr>
+          <w:color w:val="000000"/>
+        </w:rPr>
+        <w:t xml:space="preserve">make_split </w:t>
+      </w:r>
+      <w:r>
+        <w:rPr>
+          <w:rFonts w:hint="eastAsia"/>
+          <w:color w:val="000000"/>
+        </w:rPr>
+        <w:t>使用固定场景哈希将训练场景划为约</w:t>
+      </w:r>
+      <w:r>
+        <w:rPr>
+          <w:color w:val="000000"/>
+        </w:rPr>
+        <w:t xml:space="preserve"> 75% </w:t>
+      </w:r>
+      <w:r>
+        <w:rPr>
+          <w:rFonts w:hint="eastAsia"/>
+          <w:color w:val="000000"/>
+        </w:rPr>
+        <w:t>校准场景与</w:t>
+      </w:r>
+      <w:r>
+        <w:rPr>
+          <w:color w:val="000000"/>
+        </w:rPr>
+        <w:t xml:space="preserve"> 25% </w:t>
+      </w:r>
+      <w:r>
+        <w:rPr>
+          <w:rFonts w:hint="eastAsia"/>
+          <w:color w:val="000000"/>
+        </w:rPr>
+        <w:t>开发场景，再按类别确定性抽样。分别使用</w:t>
+      </w:r>
+      <w:r>
+        <w:rPr>
+          <w:color w:val="000000"/>
+        </w:rPr>
+        <w:t xml:space="preserve"> --partition calibration </w:t>
+      </w:r>
+      <w:r>
+        <w:rPr>
+          <w:rFonts w:hint="eastAsia"/>
+          <w:color w:val="000000"/>
+        </w:rPr>
+        <w:t>与</w:t>
+      </w:r>
+      <w:r>
+        <w:rPr>
+          <w:color w:val="000000"/>
+        </w:rPr>
+        <w:t xml:space="preserve"> --partition development</w:t>
+      </w:r>
+      <w:r>
+        <w:rPr>
+          <w:rFonts w:hint="eastAsia"/>
+          <w:color w:val="000000"/>
+        </w:rPr>
+        <w:t>，生成后核查场景交集为空。初始</w:t>
+      </w:r>
+      <w:r>
+        <w:rPr>
+          <w:color w:val="000000"/>
+        </w:rPr>
+        <w:t xml:space="preserve"> smoke5 </w:t>
+      </w:r>
+      <w:r>
+        <w:rPr>
+          <w:rFonts w:hint="eastAsia"/>
+          <w:color w:val="000000"/>
+        </w:rPr>
+        <w:t>已冻结，不因抽样工具更新而重建。</w:t>
       </w:r>
     </w:p>
     <w:p>
@@ -2734,6 +2799,7 @@
           <w:rFonts w:hint="eastAsia"/>
           <w:color w:val="000000"/>
         </w:rPr>
+        <w:lastRenderedPageBreak/>
         <w:t>进入</w:t>
       </w:r>
       <w:r>
@@ -2760,15 +2826,7 @@
           <w:rFonts w:hint="eastAsia"/>
           <w:color w:val="000000"/>
         </w:rPr>
-        <w:t>下</w:t>
-      </w:r>
-      <w:r>
-        <w:rPr>
-          <w:rFonts w:hint="eastAsia"/>
-          <w:color w:val="000000"/>
-        </w:rPr>
-        <w:lastRenderedPageBreak/>
-        <w:t>稳定；收益可以通过证据质量与失败转移解释；完整导航代价可接受。无需硬性预设</w:t>
+        <w:t>下稳定；收益可以通过证据质量与失败转移解释；完整导航代价可接受。无需硬性预设</w:t>
       </w:r>
       <w:r>
         <w:rPr>
@@ -4354,7 +4412,7 @@
     <w:link w:val="10"/>
     <w:uiPriority w:val="9"/>
     <w:qFormat/>
-    <w:rsid w:val="00A4601C"/>
+    <w:rsid w:val="00256E95"/>
     <w:pPr>
       <w:keepNext/>
       <w:keepLines/>
@@ -4377,7 +4435,7 @@
     <w:semiHidden/>
     <w:unhideWhenUsed/>
     <w:qFormat/>
-    <w:rsid w:val="00A4601C"/>
+    <w:rsid w:val="00256E95"/>
     <w:pPr>
       <w:keepNext/>
       <w:keepLines/>
@@ -4400,7 +4458,7 @@
     <w:semiHidden/>
     <w:unhideWhenUsed/>
     <w:qFormat/>
-    <w:rsid w:val="00A4601C"/>
+    <w:rsid w:val="00256E95"/>
     <w:pPr>
       <w:keepNext/>
       <w:keepLines/>
@@ -4423,7 +4481,7 @@
     <w:semiHidden/>
     <w:unhideWhenUsed/>
     <w:qFormat/>
-    <w:rsid w:val="00A4601C"/>
+    <w:rsid w:val="00256E95"/>
     <w:pPr>
       <w:keepNext/>
       <w:keepLines/>
@@ -4446,7 +4504,7 @@
     <w:semiHidden/>
     <w:unhideWhenUsed/>
     <w:qFormat/>
-    <w:rsid w:val="00A4601C"/>
+    <w:rsid w:val="00256E95"/>
     <w:pPr>
       <w:keepNext/>
       <w:keepLines/>
@@ -4468,7 +4526,7 @@
     <w:semiHidden/>
     <w:unhideWhenUsed/>
     <w:qFormat/>
-    <w:rsid w:val="00A4601C"/>
+    <w:rsid w:val="00256E95"/>
     <w:pPr>
       <w:keepNext/>
       <w:keepLines/>
@@ -4491,7 +4549,7 @@
     <w:semiHidden/>
     <w:unhideWhenUsed/>
     <w:qFormat/>
-    <w:rsid w:val="00A4601C"/>
+    <w:rsid w:val="00256E95"/>
     <w:pPr>
       <w:keepNext/>
       <w:keepLines/>
@@ -4514,7 +4572,7 @@
     <w:semiHidden/>
     <w:unhideWhenUsed/>
     <w:qFormat/>
-    <w:rsid w:val="00A4601C"/>
+    <w:rsid w:val="00256E95"/>
     <w:pPr>
       <w:keepNext/>
       <w:keepLines/>
@@ -4535,7 +4593,7 @@
     <w:semiHidden/>
     <w:unhideWhenUsed/>
     <w:qFormat/>
-    <w:rsid w:val="00A4601C"/>
+    <w:rsid w:val="00256E95"/>
     <w:pPr>
       <w:keepNext/>
       <w:keepLines/>
@@ -4579,7 +4637,7 @@
     <w:basedOn w:val="a0"/>
     <w:link w:val="1"/>
     <w:uiPriority w:val="9"/>
-    <w:rsid w:val="00A4601C"/>
+    <w:rsid w:val="00256E95"/>
     <w:rPr>
       <w:rFonts w:asciiTheme="majorHAnsi" w:eastAsiaTheme="majorEastAsia" w:hAnsiTheme="majorHAnsi" w:cstheme="majorBidi"/>
       <w:color w:val="0F4761" w:themeColor="accent1" w:themeShade="BF"/>
@@ -4593,7 +4651,7 @@
     <w:link w:val="2"/>
     <w:uiPriority w:val="9"/>
     <w:semiHidden/>
-    <w:rsid w:val="00A4601C"/>
+    <w:rsid w:val="00256E95"/>
     <w:rPr>
       <w:rFonts w:asciiTheme="majorHAnsi" w:eastAsiaTheme="majorEastAsia" w:hAnsiTheme="majorHAnsi" w:cstheme="majorBidi"/>
       <w:color w:val="0F4761" w:themeColor="accent1" w:themeShade="BF"/>
@@ -4607,7 +4665,7 @@
     <w:link w:val="3"/>
     <w:uiPriority w:val="9"/>
     <w:semiHidden/>
-    <w:rsid w:val="00A4601C"/>
+    <w:rsid w:val="00256E95"/>
     <w:rPr>
       <w:rFonts w:asciiTheme="majorHAnsi" w:eastAsiaTheme="majorEastAsia" w:hAnsiTheme="majorHAnsi" w:cstheme="majorBidi"/>
       <w:color w:val="0F4761" w:themeColor="accent1" w:themeShade="BF"/>
@@ -4621,7 +4679,7 @@
     <w:link w:val="4"/>
     <w:uiPriority w:val="9"/>
     <w:semiHidden/>
-    <w:rsid w:val="00A4601C"/>
+    <w:rsid w:val="00256E95"/>
     <w:rPr>
       <w:rFonts w:cstheme="majorBidi"/>
       <w:color w:val="0F4761" w:themeColor="accent1" w:themeShade="BF"/>
@@ -4635,7 +4693,7 @@
     <w:link w:val="5"/>
     <w:uiPriority w:val="9"/>
     <w:semiHidden/>
-    <w:rsid w:val="00A4601C"/>
+    <w:rsid w:val="00256E95"/>
     <w:rPr>
       <w:rFonts w:cstheme="majorBidi"/>
       <w:color w:val="0F4761" w:themeColor="accent1" w:themeShade="BF"/>
@@ -4648,7 +4706,7 @@
     <w:link w:val="6"/>
     <w:uiPriority w:val="9"/>
     <w:semiHidden/>
-    <w:rsid w:val="00A4601C"/>
+    <w:rsid w:val="00256E95"/>
     <w:rPr>
       <w:rFonts w:cstheme="majorBidi"/>
       <w:b/>
@@ -4662,7 +4720,7 @@
     <w:link w:val="7"/>
     <w:uiPriority w:val="9"/>
     <w:semiHidden/>
-    <w:rsid w:val="00A4601C"/>
+    <w:rsid w:val="00256E95"/>
     <w:rPr>
       <w:rFonts w:cstheme="majorBidi"/>
       <w:b/>
@@ -4676,7 +4734,7 @@
     <w:link w:val="8"/>
     <w:uiPriority w:val="9"/>
     <w:semiHidden/>
-    <w:rsid w:val="00A4601C"/>
+    <w:rsid w:val="00256E95"/>
     <w:rPr>
       <w:rFonts w:cstheme="majorBidi"/>
       <w:color w:val="595959" w:themeColor="text1" w:themeTint="A6"/>
@@ -4688,7 +4746,7 @@
     <w:link w:val="9"/>
     <w:uiPriority w:val="9"/>
     <w:semiHidden/>
-    <w:rsid w:val="00A4601C"/>
+    <w:rsid w:val="00256E95"/>
     <w:rPr>
       <w:rFonts w:eastAsiaTheme="majorEastAsia" w:cstheme="majorBidi"/>
       <w:color w:val="595959" w:themeColor="text1" w:themeTint="A6"/>
@@ -4701,7 +4759,7 @@
     <w:link w:val="a4"/>
     <w:uiPriority w:val="10"/>
     <w:qFormat/>
-    <w:rsid w:val="00A4601C"/>
+    <w:rsid w:val="00256E95"/>
     <w:pPr>
       <w:contextualSpacing/>
       <w:jc w:val="center"/>
@@ -4719,7 +4777,7 @@
     <w:basedOn w:val="a0"/>
     <w:link w:val="a3"/>
     <w:uiPriority w:val="10"/>
-    <w:rsid w:val="00A4601C"/>
+    <w:rsid w:val="00256E95"/>
     <w:rPr>
       <w:rFonts w:asciiTheme="majorHAnsi" w:eastAsiaTheme="majorEastAsia" w:hAnsiTheme="majorHAnsi" w:cstheme="majorBidi"/>
       <w:spacing w:val="-10"/>
@@ -4735,7 +4793,7 @@
     <w:link w:val="a6"/>
     <w:uiPriority w:val="11"/>
     <w:qFormat/>
-    <w:rsid w:val="00A4601C"/>
+    <w:rsid w:val="00256E95"/>
     <w:pPr>
       <w:numPr>
         <w:ilvl w:val="1"/>
@@ -4755,7 +4813,7 @@
     <w:basedOn w:val="a0"/>
     <w:link w:val="a5"/>
     <w:uiPriority w:val="11"/>
-    <w:rsid w:val="00A4601C"/>
+    <w:rsid w:val="00256E95"/>
     <w:rPr>
       <w:rFonts w:asciiTheme="majorHAnsi" w:eastAsiaTheme="majorEastAsia" w:hAnsiTheme="majorHAnsi" w:cstheme="majorBidi"/>
       <w:color w:val="595959" w:themeColor="text1" w:themeTint="A6"/>
@@ -4771,7 +4829,7 @@
     <w:link w:val="a8"/>
     <w:uiPriority w:val="29"/>
     <w:qFormat/>
-    <w:rsid w:val="00A4601C"/>
+    <w:rsid w:val="00256E95"/>
     <w:pPr>
       <w:spacing w:before="160"/>
       <w:jc w:val="center"/>
@@ -4787,7 +4845,7 @@
     <w:basedOn w:val="a0"/>
     <w:link w:val="a7"/>
     <w:uiPriority w:val="29"/>
-    <w:rsid w:val="00A4601C"/>
+    <w:rsid w:val="00256E95"/>
     <w:rPr>
       <w:i/>
       <w:iCs/>
@@ -4799,7 +4857,7 @@
     <w:basedOn w:val="a"/>
     <w:uiPriority w:val="34"/>
     <w:qFormat/>
-    <w:rsid w:val="00A4601C"/>
+    <w:rsid w:val="00256E95"/>
     <w:pPr>
       <w:ind w:left="720"/>
       <w:contextualSpacing/>
@@ -4810,7 +4868,7 @@
     <w:basedOn w:val="a0"/>
     <w:uiPriority w:val="21"/>
     <w:qFormat/>
-    <w:rsid w:val="00A4601C"/>
+    <w:rsid w:val="00256E95"/>
     <w:rPr>
       <w:i/>
       <w:iCs/>
@@ -4824,7 +4882,7 @@
     <w:link w:val="ac"/>
     <w:uiPriority w:val="30"/>
     <w:qFormat/>
-    <w:rsid w:val="00A4601C"/>
+    <w:rsid w:val="00256E95"/>
     <w:pPr>
       <w:pBdr>
         <w:top w:val="single" w:sz="4" w:space="10" w:color="0F4761" w:themeColor="accent1" w:themeShade="BF"/>
@@ -4845,7 +4903,7 @@
     <w:basedOn w:val="a0"/>
     <w:link w:val="ab"/>
     <w:uiPriority w:val="30"/>
-    <w:rsid w:val="00A4601C"/>
+    <w:rsid w:val="00256E95"/>
     <w:rPr>
       <w:i/>
       <w:iCs/>
@@ -4857,7 +4915,7 @@
     <w:basedOn w:val="a0"/>
     <w:uiPriority w:val="32"/>
     <w:qFormat/>
-    <w:rsid w:val="00A4601C"/>
+    <w:rsid w:val="00256E95"/>
     <w:rPr>
       <w:b/>
       <w:bCs/>

</xml_diff>

<commit_message>
Align reviewed Word protocol with tested server device configuration
</commit_message>
<xml_diff>
--- a/AV-Nav_主动视觉验证零样本目标导航研究方案.docx
+++ b/AV-Nav_主动视觉验证零样本目标导航研究方案.docx
@@ -1010,7 +1010,72 @@
           <w:rFonts w:hint="eastAsia"/>
           <w:color w:val="000000"/>
         </w:rPr>
-        <w:t>。第一轮选择</w:t>
+        <w:t>。既有</w:t>
+      </w:r>
+      <w:r>
+        <w:rPr>
+          <w:color w:val="000000"/>
+        </w:rPr>
+        <w:t xml:space="preserve"> CUDA 11.3 </w:t>
+      </w:r>
+      <w:r>
+        <w:rPr>
+          <w:rFonts w:hint="eastAsia"/>
+          <w:color w:val="000000"/>
+        </w:rPr>
+        <w:t>与</w:t>
+      </w:r>
+      <w:r>
+        <w:rPr>
+          <w:color w:val="000000"/>
+        </w:rPr>
+        <w:t xml:space="preserve"> RTX Ada </w:t>
+      </w:r>
+      <w:r>
+        <w:rPr>
+          <w:rFonts w:hint="eastAsia"/>
+          <w:color w:val="000000"/>
+        </w:rPr>
+        <w:t>的</w:t>
+      </w:r>
+      <w:r>
+        <w:rPr>
+          <w:color w:val="000000"/>
+        </w:rPr>
+        <w:t xml:space="preserve"> DINO NVRTC </w:t>
+      </w:r>
+      <w:r>
+        <w:rPr>
+          <w:rFonts w:hint="eastAsia"/>
+          <w:color w:val="000000"/>
+        </w:rPr>
+        <w:t>运算不兼容，因此</w:t>
+      </w:r>
+      <w:r>
+        <w:rPr>
+          <w:color w:val="000000"/>
+        </w:rPr>
+        <w:t xml:space="preserve"> DINO </w:t>
+      </w:r>
+      <w:r>
+        <w:rPr>
+          <w:rFonts w:hint="eastAsia"/>
+          <w:color w:val="000000"/>
+        </w:rPr>
+        <w:t>默认使用</w:t>
+      </w:r>
+      <w:r>
+        <w:rPr>
+          <w:color w:val="000000"/>
+        </w:rPr>
+        <w:t xml:space="preserve"> CPU</w:t>
+      </w:r>
+      <w:r>
+        <w:rPr>
+          <w:rFonts w:hint="eastAsia"/>
+          <w:color w:val="000000"/>
+        </w:rPr>
+        <w:t>，其余模型与导航使用</w:t>
       </w:r>
       <w:r>
         <w:rPr>
@@ -1023,7 +1088,20 @@
           <w:rFonts w:hint="eastAsia"/>
           <w:color w:val="000000"/>
         </w:rPr>
-        <w:t>；每次启动前检查显存及既有作业。服务只监听本机，推理缓存优先使用已有离线权重。</w:t>
+        <w:t>。所有对照共享该设置；启动前检查显存及既有作业。服务只监听本机，使用已有离线权重，不升级原</w:t>
+      </w:r>
+      <w:r>
+        <w:rPr>
+          <w:color w:val="000000"/>
+        </w:rPr>
+        <w:t xml:space="preserve"> conda </w:t>
+      </w:r>
+      <w:r>
+        <w:rPr>
+          <w:rFonts w:hint="eastAsia"/>
+          <w:color w:val="000000"/>
+        </w:rPr>
+        <w:t>环境。</w:t>
       </w:r>
     </w:p>
     <w:p>
@@ -4412,7 +4490,7 @@
     <w:link w:val="10"/>
     <w:uiPriority w:val="9"/>
     <w:qFormat/>
-    <w:rsid w:val="00256E95"/>
+    <w:rsid w:val="00F60F4F"/>
     <w:pPr>
       <w:keepNext/>
       <w:keepLines/>
@@ -4435,7 +4513,7 @@
     <w:semiHidden/>
     <w:unhideWhenUsed/>
     <w:qFormat/>
-    <w:rsid w:val="00256E95"/>
+    <w:rsid w:val="00F60F4F"/>
     <w:pPr>
       <w:keepNext/>
       <w:keepLines/>
@@ -4458,7 +4536,7 @@
     <w:semiHidden/>
     <w:unhideWhenUsed/>
     <w:qFormat/>
-    <w:rsid w:val="00256E95"/>
+    <w:rsid w:val="00F60F4F"/>
     <w:pPr>
       <w:keepNext/>
       <w:keepLines/>
@@ -4481,7 +4559,7 @@
     <w:semiHidden/>
     <w:unhideWhenUsed/>
     <w:qFormat/>
-    <w:rsid w:val="00256E95"/>
+    <w:rsid w:val="00F60F4F"/>
     <w:pPr>
       <w:keepNext/>
       <w:keepLines/>
@@ -4504,7 +4582,7 @@
     <w:semiHidden/>
     <w:unhideWhenUsed/>
     <w:qFormat/>
-    <w:rsid w:val="00256E95"/>
+    <w:rsid w:val="00F60F4F"/>
     <w:pPr>
       <w:keepNext/>
       <w:keepLines/>
@@ -4526,7 +4604,7 @@
     <w:semiHidden/>
     <w:unhideWhenUsed/>
     <w:qFormat/>
-    <w:rsid w:val="00256E95"/>
+    <w:rsid w:val="00F60F4F"/>
     <w:pPr>
       <w:keepNext/>
       <w:keepLines/>
@@ -4549,7 +4627,7 @@
     <w:semiHidden/>
     <w:unhideWhenUsed/>
     <w:qFormat/>
-    <w:rsid w:val="00256E95"/>
+    <w:rsid w:val="00F60F4F"/>
     <w:pPr>
       <w:keepNext/>
       <w:keepLines/>
@@ -4572,7 +4650,7 @@
     <w:semiHidden/>
     <w:unhideWhenUsed/>
     <w:qFormat/>
-    <w:rsid w:val="00256E95"/>
+    <w:rsid w:val="00F60F4F"/>
     <w:pPr>
       <w:keepNext/>
       <w:keepLines/>
@@ -4593,7 +4671,7 @@
     <w:semiHidden/>
     <w:unhideWhenUsed/>
     <w:qFormat/>
-    <w:rsid w:val="00256E95"/>
+    <w:rsid w:val="00F60F4F"/>
     <w:pPr>
       <w:keepNext/>
       <w:keepLines/>
@@ -4637,7 +4715,7 @@
     <w:basedOn w:val="a0"/>
     <w:link w:val="1"/>
     <w:uiPriority w:val="9"/>
-    <w:rsid w:val="00256E95"/>
+    <w:rsid w:val="00F60F4F"/>
     <w:rPr>
       <w:rFonts w:asciiTheme="majorHAnsi" w:eastAsiaTheme="majorEastAsia" w:hAnsiTheme="majorHAnsi" w:cstheme="majorBidi"/>
       <w:color w:val="0F4761" w:themeColor="accent1" w:themeShade="BF"/>
@@ -4651,7 +4729,7 @@
     <w:link w:val="2"/>
     <w:uiPriority w:val="9"/>
     <w:semiHidden/>
-    <w:rsid w:val="00256E95"/>
+    <w:rsid w:val="00F60F4F"/>
     <w:rPr>
       <w:rFonts w:asciiTheme="majorHAnsi" w:eastAsiaTheme="majorEastAsia" w:hAnsiTheme="majorHAnsi" w:cstheme="majorBidi"/>
       <w:color w:val="0F4761" w:themeColor="accent1" w:themeShade="BF"/>
@@ -4665,7 +4743,7 @@
     <w:link w:val="3"/>
     <w:uiPriority w:val="9"/>
     <w:semiHidden/>
-    <w:rsid w:val="00256E95"/>
+    <w:rsid w:val="00F60F4F"/>
     <w:rPr>
       <w:rFonts w:asciiTheme="majorHAnsi" w:eastAsiaTheme="majorEastAsia" w:hAnsiTheme="majorHAnsi" w:cstheme="majorBidi"/>
       <w:color w:val="0F4761" w:themeColor="accent1" w:themeShade="BF"/>
@@ -4679,7 +4757,7 @@
     <w:link w:val="4"/>
     <w:uiPriority w:val="9"/>
     <w:semiHidden/>
-    <w:rsid w:val="00256E95"/>
+    <w:rsid w:val="00F60F4F"/>
     <w:rPr>
       <w:rFonts w:cstheme="majorBidi"/>
       <w:color w:val="0F4761" w:themeColor="accent1" w:themeShade="BF"/>
@@ -4693,7 +4771,7 @@
     <w:link w:val="5"/>
     <w:uiPriority w:val="9"/>
     <w:semiHidden/>
-    <w:rsid w:val="00256E95"/>
+    <w:rsid w:val="00F60F4F"/>
     <w:rPr>
       <w:rFonts w:cstheme="majorBidi"/>
       <w:color w:val="0F4761" w:themeColor="accent1" w:themeShade="BF"/>
@@ -4706,7 +4784,7 @@
     <w:link w:val="6"/>
     <w:uiPriority w:val="9"/>
     <w:semiHidden/>
-    <w:rsid w:val="00256E95"/>
+    <w:rsid w:val="00F60F4F"/>
     <w:rPr>
       <w:rFonts w:cstheme="majorBidi"/>
       <w:b/>
@@ -4720,7 +4798,7 @@
     <w:link w:val="7"/>
     <w:uiPriority w:val="9"/>
     <w:semiHidden/>
-    <w:rsid w:val="00256E95"/>
+    <w:rsid w:val="00F60F4F"/>
     <w:rPr>
       <w:rFonts w:cstheme="majorBidi"/>
       <w:b/>
@@ -4734,7 +4812,7 @@
     <w:link w:val="8"/>
     <w:uiPriority w:val="9"/>
     <w:semiHidden/>
-    <w:rsid w:val="00256E95"/>
+    <w:rsid w:val="00F60F4F"/>
     <w:rPr>
       <w:rFonts w:cstheme="majorBidi"/>
       <w:color w:val="595959" w:themeColor="text1" w:themeTint="A6"/>
@@ -4746,7 +4824,7 @@
     <w:link w:val="9"/>
     <w:uiPriority w:val="9"/>
     <w:semiHidden/>
-    <w:rsid w:val="00256E95"/>
+    <w:rsid w:val="00F60F4F"/>
     <w:rPr>
       <w:rFonts w:eastAsiaTheme="majorEastAsia" w:cstheme="majorBidi"/>
       <w:color w:val="595959" w:themeColor="text1" w:themeTint="A6"/>
@@ -4759,7 +4837,7 @@
     <w:link w:val="a4"/>
     <w:uiPriority w:val="10"/>
     <w:qFormat/>
-    <w:rsid w:val="00256E95"/>
+    <w:rsid w:val="00F60F4F"/>
     <w:pPr>
       <w:contextualSpacing/>
       <w:jc w:val="center"/>
@@ -4777,7 +4855,7 @@
     <w:basedOn w:val="a0"/>
     <w:link w:val="a3"/>
     <w:uiPriority w:val="10"/>
-    <w:rsid w:val="00256E95"/>
+    <w:rsid w:val="00F60F4F"/>
     <w:rPr>
       <w:rFonts w:asciiTheme="majorHAnsi" w:eastAsiaTheme="majorEastAsia" w:hAnsiTheme="majorHAnsi" w:cstheme="majorBidi"/>
       <w:spacing w:val="-10"/>
@@ -4793,7 +4871,7 @@
     <w:link w:val="a6"/>
     <w:uiPriority w:val="11"/>
     <w:qFormat/>
-    <w:rsid w:val="00256E95"/>
+    <w:rsid w:val="00F60F4F"/>
     <w:pPr>
       <w:numPr>
         <w:ilvl w:val="1"/>
@@ -4813,7 +4891,7 @@
     <w:basedOn w:val="a0"/>
     <w:link w:val="a5"/>
     <w:uiPriority w:val="11"/>
-    <w:rsid w:val="00256E95"/>
+    <w:rsid w:val="00F60F4F"/>
     <w:rPr>
       <w:rFonts w:asciiTheme="majorHAnsi" w:eastAsiaTheme="majorEastAsia" w:hAnsiTheme="majorHAnsi" w:cstheme="majorBidi"/>
       <w:color w:val="595959" w:themeColor="text1" w:themeTint="A6"/>
@@ -4829,7 +4907,7 @@
     <w:link w:val="a8"/>
     <w:uiPriority w:val="29"/>
     <w:qFormat/>
-    <w:rsid w:val="00256E95"/>
+    <w:rsid w:val="00F60F4F"/>
     <w:pPr>
       <w:spacing w:before="160"/>
       <w:jc w:val="center"/>
@@ -4845,7 +4923,7 @@
     <w:basedOn w:val="a0"/>
     <w:link w:val="a7"/>
     <w:uiPriority w:val="29"/>
-    <w:rsid w:val="00256E95"/>
+    <w:rsid w:val="00F60F4F"/>
     <w:rPr>
       <w:i/>
       <w:iCs/>
@@ -4857,7 +4935,7 @@
     <w:basedOn w:val="a"/>
     <w:uiPriority w:val="34"/>
     <w:qFormat/>
-    <w:rsid w:val="00256E95"/>
+    <w:rsid w:val="00F60F4F"/>
     <w:pPr>
       <w:ind w:left="720"/>
       <w:contextualSpacing/>
@@ -4868,7 +4946,7 @@
     <w:basedOn w:val="a0"/>
     <w:uiPriority w:val="21"/>
     <w:qFormat/>
-    <w:rsid w:val="00256E95"/>
+    <w:rsid w:val="00F60F4F"/>
     <w:rPr>
       <w:i/>
       <w:iCs/>
@@ -4882,7 +4960,7 @@
     <w:link w:val="ac"/>
     <w:uiPriority w:val="30"/>
     <w:qFormat/>
-    <w:rsid w:val="00256E95"/>
+    <w:rsid w:val="00F60F4F"/>
     <w:pPr>
       <w:pBdr>
         <w:top w:val="single" w:sz="4" w:space="10" w:color="0F4761" w:themeColor="accent1" w:themeShade="BF"/>
@@ -4903,7 +4981,7 @@
     <w:basedOn w:val="a0"/>
     <w:link w:val="ab"/>
     <w:uiPriority w:val="30"/>
-    <w:rsid w:val="00256E95"/>
+    <w:rsid w:val="00F60F4F"/>
     <w:rPr>
       <w:i/>
       <w:iCs/>
@@ -4915,7 +4993,7 @@
     <w:basedOn w:val="a0"/>
     <w:uiPriority w:val="32"/>
     <w:qFormat/>
-    <w:rsid w:val="00256E95"/>
+    <w:rsid w:val="00F60F4F"/>
     <w:rPr>
       <w:b/>
       <w:bCs/>

</xml_diff>